<commit_message>
calctapp5d motion-brief: docx regenerated at the model's EB Garamond (XENG pass); latex held back, reasons in eval.yaml (fb-595.54.57)
Co-Authored-By: Claude Opus 5.5 <noreply@anthropic.com>
</commit_message>
<xml_diff>
--- a/courts/ninth-circuit/california/state/court-of-appeal-fifth-district/motion-brief/usage/OUTPUT-motion-brief.docx
+++ b/courts/ninth-circuit/california/state/court-of-appeal-fifth-district/motion-brief/usage/OUTPUT-motion-brief.docx
@@ -2500,6 +2500,7 @@
     <w:unhideWhenUsed/>
     <w:qFormat/>
     <w:pPr>
+      <w:keepLines/>
       <w:spacing w:before="0" w:after="130" w:line="338" w:lineRule="exact"/>
     </w:pPr>
     <w:rPr>
@@ -2750,6 +2751,33 @@
     <w:pPr>
       <w:spacing w:before="0" w:after="0" w:line="338" w:lineRule="exact"/>
       <w:ind w:left="2160" w:hanging="720"/>
+    </w:pPr>
+  </w:style>
+  <w:style w:type="paragraph" w:customStyle="1" w:styleId="XdQuoteList1">
+    <w:name w:val="Xd Quote List 1"/>
+    <w:basedOn w:val="Normal"/>
+    <w:qFormat/>
+    <w:pPr>
+      <w:spacing w:before="0" w:after="0" w:line="338" w:lineRule="exact"/>
+      <w:ind w:left="1440" w:right="720" w:hanging="720"/>
+    </w:pPr>
+  </w:style>
+  <w:style w:type="paragraph" w:customStyle="1" w:styleId="XdQuoteList2">
+    <w:name w:val="Xd Quote List 2"/>
+    <w:basedOn w:val="Normal"/>
+    <w:qFormat/>
+    <w:pPr>
+      <w:spacing w:before="0" w:after="0" w:line="338" w:lineRule="exact"/>
+      <w:ind w:left="2160" w:right="720" w:hanging="720"/>
+    </w:pPr>
+  </w:style>
+  <w:style w:type="paragraph" w:customStyle="1" w:styleId="XdQuoteList3">
+    <w:name w:val="Xd Quote List 3"/>
+    <w:basedOn w:val="Normal"/>
+    <w:qFormat/>
+    <w:pPr>
+      <w:spacing w:before="0" w:after="0" w:line="338" w:lineRule="exact"/>
+      <w:ind w:left="2880" w:right="720" w:hanging="720"/>
     </w:pPr>
   </w:style>
   <w:style w:type="paragraph" w:customStyle="1" w:styleId="SourceCode">

</xml_diff>